<commit_message>
Języki i Paradygmaty 5 filozofów
</commit_message>
<xml_diff>
--- a/Pwr/Sem4/AlgorytmyMetaheurystyczne/Lista2/Sprawozdanie_lista2.docx
+++ b/Pwr/Sem4/AlgorytmyMetaheurystyczne/Lista2/Sprawozdanie_lista2.docx
@@ -10,13 +10,31 @@
           <w:szCs w:val="32"/>
         </w:rPr>
       </w:pPr>
+      <w:proofErr w:type="spellStart"/>
       <w:r>
         <w:rPr>
           <w:rFonts w:ascii="Times New Roman" w:hAnsi="Times New Roman" w:cs="Times New Roman"/>
           <w:sz w:val="32"/>
           <w:szCs w:val="32"/>
         </w:rPr>
-        <w:t>Lista 2</w:t>
+        <w:t>g</w:t>
+      </w:r>
+      <w:r>
+        <w:rPr>
+          <w:rFonts w:ascii="Times New Roman" w:hAnsi="Times New Roman" w:cs="Times New Roman"/>
+          <w:sz w:val="32"/>
+          <w:szCs w:val="32"/>
+        </w:rPr>
+        <w:t>Lista</w:t>
+      </w:r>
+      <w:proofErr w:type="spellEnd"/>
+      <w:r>
+        <w:rPr>
+          <w:rFonts w:ascii="Times New Roman" w:hAnsi="Times New Roman" w:cs="Times New Roman"/>
+          <w:sz w:val="32"/>
+          <w:szCs w:val="32"/>
+        </w:rPr>
+        <w:t xml:space="preserve"> 2</w:t>
       </w:r>
     </w:p>
     <w:tbl>
@@ -2528,6 +2546,7 @@
       <w:r>
         <w:rPr>
           <w:rFonts w:ascii="Times New Roman" w:hAnsi="Times New Roman" w:cs="Times New Roman"/>
+          <w:noProof/>
           <w:sz w:val="28"/>
           <w:szCs w:val="28"/>
         </w:rPr>
@@ -2590,6 +2609,7 @@
       <w:r>
         <w:rPr>
           <w:rFonts w:ascii="Times New Roman" w:hAnsi="Times New Roman" w:cs="Times New Roman"/>
+          <w:noProof/>
           <w:sz w:val="28"/>
           <w:szCs w:val="28"/>
         </w:rPr>
@@ -2958,6 +2978,7 @@
       <w:r>
         <w:rPr>
           <w:rFonts w:ascii="Times New Roman" w:hAnsi="Times New Roman" w:cs="Times New Roman"/>
+          <w:noProof/>
           <w:sz w:val="24"/>
           <w:szCs w:val="24"/>
         </w:rPr>
@@ -3023,6 +3044,7 @@
       <w:r>
         <w:rPr>
           <w:rFonts w:ascii="Times New Roman" w:hAnsi="Times New Roman" w:cs="Times New Roman"/>
+          <w:noProof/>
           <w:sz w:val="24"/>
           <w:szCs w:val="24"/>
         </w:rPr>
@@ -3079,6 +3101,7 @@
       <w:r>
         <w:rPr>
           <w:rFonts w:ascii="Times New Roman" w:hAnsi="Times New Roman" w:cs="Times New Roman"/>
+          <w:noProof/>
           <w:sz w:val="24"/>
           <w:szCs w:val="24"/>
         </w:rPr>

</xml_diff>